<commit_message>
Auto update schedule HTML
</commit_message>
<xml_diff>
--- a/weekly.docx
+++ b/weekly.docx
@@ -23,13 +23,13 @@
         <w:tblLook w:firstColumn="1" w:firstRow="1" w:lastColumn="0" w:lastRow="0" w:noHBand="0" w:noVBand="1" w:val="04A0"/>
       </w:tblPr>
       <w:tblGrid>
-        <w:gridCol w:w="4320"/>
-        <w:gridCol w:w="4320"/>
+        <w:gridCol w:w="8136"/>
+        <w:gridCol w:w="8136"/>
       </w:tblGrid>
       <w:tr>
         <w:tc>
           <w:tcPr>
-            <w:tcW w:type="dxa" w:w="4320"/>
+            <w:tcW w:type="dxa" w:w="8136"/>
           </w:tcPr>
           <w:p>
             <w:r>
@@ -39,7 +39,7 @@
         </w:tc>
         <w:tc>
           <w:tcPr>
-            <w:tcW w:type="dxa" w:w="4320"/>
+            <w:tcW w:type="dxa" w:w="8136"/>
           </w:tcPr>
           <w:p>
             <w:r>
@@ -51,7 +51,7 @@
       <w:tr>
         <w:tc>
           <w:tcPr>
-            <w:tcW w:type="dxa" w:w="4320"/>
+            <w:tcW w:type="dxa" w:w="8136"/>
           </w:tcPr>
           <w:p/>
           <w:p>
@@ -99,7 +99,7 @@
         </w:tc>
         <w:tc>
           <w:tcPr>
-            <w:tcW w:type="dxa" w:w="4320"/>
+            <w:tcW w:type="dxa" w:w="8136"/>
           </w:tcPr>
           <w:p/>
           <w:p>
@@ -152,13 +152,13 @@
         <w:tblLook w:firstColumn="1" w:firstRow="1" w:lastColumn="0" w:lastRow="0" w:noHBand="0" w:noVBand="1" w:val="04A0"/>
       </w:tblPr>
       <w:tblGrid>
-        <w:gridCol w:w="4320"/>
-        <w:gridCol w:w="4320"/>
+        <w:gridCol w:w="8136"/>
+        <w:gridCol w:w="8136"/>
       </w:tblGrid>
       <w:tr>
         <w:tc>
           <w:tcPr>
-            <w:tcW w:type="dxa" w:w="4320"/>
+            <w:tcW w:type="dxa" w:w="8136"/>
           </w:tcPr>
           <w:p>
             <w:r>
@@ -168,7 +168,7 @@
         </w:tc>
         <w:tc>
           <w:tcPr>
-            <w:tcW w:type="dxa" w:w="4320"/>
+            <w:tcW w:type="dxa" w:w="8136"/>
           </w:tcPr>
           <w:p>
             <w:r>
@@ -180,7 +180,7 @@
       <w:tr>
         <w:tc>
           <w:tcPr>
-            <w:tcW w:type="dxa" w:w="4320"/>
+            <w:tcW w:type="dxa" w:w="8136"/>
           </w:tcPr>
           <w:p/>
           <w:p>
@@ -228,7 +228,7 @@
         </w:tc>
         <w:tc>
           <w:tcPr>
-            <w:tcW w:type="dxa" w:w="4320"/>
+            <w:tcW w:type="dxa" w:w="8136"/>
           </w:tcPr>
           <w:p/>
           <w:p>
@@ -323,13 +323,13 @@
         <w:tblLook w:firstColumn="1" w:firstRow="1" w:lastColumn="0" w:lastRow="0" w:noHBand="0" w:noVBand="1" w:val="04A0"/>
       </w:tblPr>
       <w:tblGrid>
-        <w:gridCol w:w="4320"/>
-        <w:gridCol w:w="4320"/>
+        <w:gridCol w:w="8136"/>
+        <w:gridCol w:w="8136"/>
       </w:tblGrid>
       <w:tr>
         <w:tc>
           <w:tcPr>
-            <w:tcW w:type="dxa" w:w="4320"/>
+            <w:tcW w:type="dxa" w:w="8136"/>
           </w:tcPr>
           <w:p>
             <w:r>
@@ -339,7 +339,7 @@
         </w:tc>
         <w:tc>
           <w:tcPr>
-            <w:tcW w:type="dxa" w:w="4320"/>
+            <w:tcW w:type="dxa" w:w="8136"/>
           </w:tcPr>
           <w:p>
             <w:r>
@@ -351,7 +351,7 @@
       <w:tr>
         <w:tc>
           <w:tcPr>
-            <w:tcW w:type="dxa" w:w="4320"/>
+            <w:tcW w:type="dxa" w:w="8136"/>
           </w:tcPr>
           <w:p/>
           <w:p>
@@ -399,7 +399,7 @@
         </w:tc>
         <w:tc>
           <w:tcPr>
-            <w:tcW w:type="dxa" w:w="4320"/>
+            <w:tcW w:type="dxa" w:w="8136"/>
           </w:tcPr>
           <w:p/>
           <w:p>
@@ -473,13 +473,13 @@
         <w:tblLook w:firstColumn="1" w:firstRow="1" w:lastColumn="0" w:lastRow="0" w:noHBand="0" w:noVBand="1" w:val="04A0"/>
       </w:tblPr>
       <w:tblGrid>
-        <w:gridCol w:w="4320"/>
-        <w:gridCol w:w="4320"/>
+        <w:gridCol w:w="8136"/>
+        <w:gridCol w:w="8136"/>
       </w:tblGrid>
       <w:tr>
         <w:tc>
           <w:tcPr>
-            <w:tcW w:type="dxa" w:w="4320"/>
+            <w:tcW w:type="dxa" w:w="8136"/>
           </w:tcPr>
           <w:p>
             <w:r>
@@ -489,7 +489,7 @@
         </w:tc>
         <w:tc>
           <w:tcPr>
-            <w:tcW w:type="dxa" w:w="4320"/>
+            <w:tcW w:type="dxa" w:w="8136"/>
           </w:tcPr>
           <w:p>
             <w:r>
@@ -501,7 +501,7 @@
       <w:tr>
         <w:tc>
           <w:tcPr>
-            <w:tcW w:type="dxa" w:w="4320"/>
+            <w:tcW w:type="dxa" w:w="8136"/>
           </w:tcPr>
           <w:p/>
           <w:p>
@@ -591,7 +591,7 @@
         </w:tc>
         <w:tc>
           <w:tcPr>
-            <w:tcW w:type="dxa" w:w="4320"/>
+            <w:tcW w:type="dxa" w:w="8136"/>
           </w:tcPr>
           <w:p/>
           <w:p>
@@ -665,13 +665,13 @@
         <w:tblLook w:firstColumn="1" w:firstRow="1" w:lastColumn="0" w:lastRow="0" w:noHBand="0" w:noVBand="1" w:val="04A0"/>
       </w:tblPr>
       <w:tblGrid>
-        <w:gridCol w:w="4320"/>
-        <w:gridCol w:w="4320"/>
+        <w:gridCol w:w="8136"/>
+        <w:gridCol w:w="8136"/>
       </w:tblGrid>
       <w:tr>
         <w:tc>
           <w:tcPr>
-            <w:tcW w:type="dxa" w:w="4320"/>
+            <w:tcW w:type="dxa" w:w="8136"/>
           </w:tcPr>
           <w:p>
             <w:r>
@@ -681,7 +681,7 @@
         </w:tc>
         <w:tc>
           <w:tcPr>
-            <w:tcW w:type="dxa" w:w="4320"/>
+            <w:tcW w:type="dxa" w:w="8136"/>
           </w:tcPr>
           <w:p>
             <w:r>
@@ -693,7 +693,7 @@
       <w:tr>
         <w:tc>
           <w:tcPr>
-            <w:tcW w:type="dxa" w:w="4320"/>
+            <w:tcW w:type="dxa" w:w="8136"/>
           </w:tcPr>
           <w:p/>
           <w:p>
@@ -741,7 +741,7 @@
         </w:tc>
         <w:tc>
           <w:tcPr>
-            <w:tcW w:type="dxa" w:w="4320"/>
+            <w:tcW w:type="dxa" w:w="8136"/>
           </w:tcPr>
           <w:p/>
           <w:p>
@@ -815,13 +815,13 @@
         <w:tblLook w:firstColumn="1" w:firstRow="1" w:lastColumn="0" w:lastRow="0" w:noHBand="0" w:noVBand="1" w:val="04A0"/>
       </w:tblPr>
       <w:tblGrid>
-        <w:gridCol w:w="4320"/>
-        <w:gridCol w:w="4320"/>
+        <w:gridCol w:w="8136"/>
+        <w:gridCol w:w="8136"/>
       </w:tblGrid>
       <w:tr>
         <w:tc>
           <w:tcPr>
-            <w:tcW w:type="dxa" w:w="4320"/>
+            <w:tcW w:type="dxa" w:w="8136"/>
           </w:tcPr>
           <w:p>
             <w:r>
@@ -831,7 +831,7 @@
         </w:tc>
         <w:tc>
           <w:tcPr>
-            <w:tcW w:type="dxa" w:w="4320"/>
+            <w:tcW w:type="dxa" w:w="8136"/>
           </w:tcPr>
           <w:p>
             <w:r>
@@ -843,7 +843,7 @@
       <w:tr>
         <w:tc>
           <w:tcPr>
-            <w:tcW w:type="dxa" w:w="4320"/>
+            <w:tcW w:type="dxa" w:w="8136"/>
           </w:tcPr>
           <w:p/>
           <w:p>
@@ -912,7 +912,7 @@
         </w:tc>
         <w:tc>
           <w:tcPr>
-            <w:tcW w:type="dxa" w:w="4320"/>
+            <w:tcW w:type="dxa" w:w="8136"/>
           </w:tcPr>
           <w:p/>
           <w:p>
@@ -1007,13 +1007,13 @@
         <w:tblLook w:firstColumn="1" w:firstRow="1" w:lastColumn="0" w:lastRow="0" w:noHBand="0" w:noVBand="1" w:val="04A0"/>
       </w:tblPr>
       <w:tblGrid>
-        <w:gridCol w:w="4320"/>
-        <w:gridCol w:w="4320"/>
+        <w:gridCol w:w="8136"/>
+        <w:gridCol w:w="8136"/>
       </w:tblGrid>
       <w:tr>
         <w:tc>
           <w:tcPr>
-            <w:tcW w:type="dxa" w:w="4320"/>
+            <w:tcW w:type="dxa" w:w="8136"/>
           </w:tcPr>
           <w:p>
             <w:r>
@@ -1023,7 +1023,7 @@
         </w:tc>
         <w:tc>
           <w:tcPr>
-            <w:tcW w:type="dxa" w:w="4320"/>
+            <w:tcW w:type="dxa" w:w="8136"/>
           </w:tcPr>
           <w:p>
             <w:r>
@@ -1035,7 +1035,7 @@
       <w:tr>
         <w:tc>
           <w:tcPr>
-            <w:tcW w:type="dxa" w:w="4320"/>
+            <w:tcW w:type="dxa" w:w="8136"/>
           </w:tcPr>
           <w:p/>
           <w:p>
@@ -1125,7 +1125,7 @@
         </w:tc>
         <w:tc>
           <w:tcPr>
-            <w:tcW w:type="dxa" w:w="4320"/>
+            <w:tcW w:type="dxa" w:w="8136"/>
           </w:tcPr>
           <w:p/>
           <w:p>
@@ -1174,8 +1174,8 @@
       </w:tr>
     </w:tbl>
     <w:sectPr>
-      <w:pgSz w:w="12240" w:h="15840"/>
-      <w:pgMar w:top="1440" w:right="1800" w:bottom="1440" w:left="1800" w:header="720" w:footer="720" w:gutter="0"/>
+      <w:pgSz w:w="16838" w:h="11906" w:orient="landscape"/>
+      <w:pgMar w:top="737" w:right="283" w:bottom="737" w:left="283" w:header="720" w:footer="720" w:gutter="0"/>
       <w:cols w:space="720"/>
       <w:docGrid w:linePitch="360"/>
     </w:sectPr>
@@ -1547,7 +1547,7 @@
     <w:qFormat/>
     <w:rsid w:val="00FC693F"/>
     <w:rPr>
-      <w:rFonts w:ascii="Yu Gothic" w:hAnsi="Yu Gothic" w:eastAsia="游ゴシック" w:cs="Yu Gothic"/>
+      <w:rFonts w:ascii="Meiryo UI" w:hAnsi="Meiryo UI" w:eastAsia="HGP創英角ｺﾞｼｯｸUB" w:cs="Meiryo UI"/>
     </w:rPr>
   </w:style>
   <w:style w:type="paragraph" w:styleId="Header">

</xml_diff>